<commit_message>
Add gitignore and remove unnecessary files
</commit_message>
<xml_diff>
--- a/Youtube Link.docx
+++ b/Youtube Link.docx
@@ -20,19 +20,27 @@
         <w:rPr>
           <w:lang w:val="en-US"/>
         </w:rPr>
-        <w:t xml:space="preserve"> link: </w:t>
+        <w:t xml:space="preserve"> link:</w:t>
+      </w:r>
+      <w:r>
+        <w:t xml:space="preserve"> </w:t>
       </w:r>
       <w:hyperlink r:id="rId4" w:history="1">
         <w:r>
           <w:rPr>
             <w:rStyle w:val="Hyperlink"/>
-            <w:rFonts w:ascii="Lato" w:hAnsi="Lato"/>
-            <w:color w:val="B52828"/>
-            <w:shd w:val="clear" w:color="auto" w:fill="F2F4F4"/>
+            <w:lang w:val="en-US"/>
           </w:rPr>
-          <w:t>https://youtu.be/zKeImfz6pU0</w:t>
+          <w:t>https://youtu.be/I7S7XL_zLVc</w:t>
         </w:r>
       </w:hyperlink>
+    </w:p>
+    <w:p>
+      <w:pPr>
+        <w:rPr>
+          <w:lang w:val="en-US"/>
+        </w:rPr>
+      </w:pPr>
     </w:p>
     <w:sectPr>
       <w:pgSz w:w="11906" w:h="16838"/>
@@ -965,12 +973,23 @@
     <w:name w:val="Hyperlink"/>
     <w:basedOn w:val="DefaultParagraphFont"/>
     <w:uiPriority w:val="99"/>
-    <w:semiHidden/>
     <w:unhideWhenUsed/>
     <w:rsid w:val="00FC2794"/>
     <w:rPr>
       <w:color w:val="0000FF"/>
       <w:u w:val="single"/>
+    </w:rPr>
+  </w:style>
+  <w:style w:type="character" w:styleId="UnresolvedMention">
+    <w:name w:val="Unresolved Mention"/>
+    <w:basedOn w:val="DefaultParagraphFont"/>
+    <w:uiPriority w:val="99"/>
+    <w:semiHidden/>
+    <w:unhideWhenUsed/>
+    <w:rsid w:val="00034FDD"/>
+    <w:rPr>
+      <w:color w:val="605E5C"/>
+      <w:shd w:val="clear" w:color="auto" w:fill="E1DFDD"/>
     </w:rPr>
   </w:style>
 </w:styles>

</xml_diff>